<commit_message>
Fill IAP meeting minutes in departmental proceedings format
Rewrite the five IAP minutes as proceedings (schedule, chair, agenda /
decision / responsible table, Head's sign-off) following the TE sample.

Co-Authored-By: Claude Opus 5.5 <noreply@anthropic.com>
Claude-Session: https://claude.ai/code/session_01ELaQ6vS1YNg97XUU7RUmR3
</commit_message>
<xml_diff>
--- a/All Annexure Citeria 10/10.1/Meeting-minutes-IAP/IAP_Meeting_Minutes_01_2023_18th_March_2023.docx
+++ b/All Annexure Citeria 10/10.1/Meeting-minutes-IAP/IAP_Meeting_Minutes_01_2023_18th_March_2023.docx
@@ -23,7 +23,7 @@
       <w:r>
         <w:drawing>
           <wp:inline xmlns:a="http://schemas.openxmlformats.org/drawingml/2006/main" xmlns:pic="http://schemas.openxmlformats.org/drawingml/2006/picture">
-            <wp:extent cx="685800" cy="685800"/>
+            <wp:extent cx="548640" cy="548640"/>
             <wp:docPr id="1" name="Picture 1"/>
             <wp:cNvGraphicFramePr>
               <a:graphicFrameLocks noChangeAspect="1"/>
@@ -44,7 +44,7 @@
                   <pic:spPr>
                     <a:xfrm>
                       <a:off x="0" y="0"/>
-                      <a:ext cx="685800" cy="685800"/>
+                      <a:ext cx="548640" cy="548640"/>
                     </a:xfrm>
                     <a:prstGeom prst="rect"/>
                   </pic:spPr>
@@ -72,22 +72,7 @@
     </w:p>
     <w:p>
       <w:pPr>
-        <w:spacing w:after="0" w:before="0"/>
-        <w:jc w:val="center"/>
-      </w:pPr>
-      <w:r>
-        <w:rPr>
-          <w:b w:val="0"/>
-          <w:i w:val="0"/>
-          <w:sz w:val="24"/>
-          <w:u w:val="none"/>
-        </w:rPr>
-        <w:t>Faculty of Engineering</w:t>
-      </w:r>
-    </w:p>
-    <w:p>
-      <w:pPr>
-        <w:spacing w:after="0" w:before="0"/>
+        <w:spacing w:after="120" w:before="0"/>
         <w:jc w:val="center"/>
       </w:pPr>
       <w:r>
@@ -102,22 +87,7 @@
     </w:p>
     <w:p>
       <w:pPr>
-        <w:spacing w:after="0" w:before="0"/>
-        <w:jc w:val="center"/>
-      </w:pPr>
-      <w:r>
-        <w:rPr>
-          <w:b/>
-          <w:i w:val="0"/>
-          <w:sz w:val="24"/>
-          <w:u w:val="none"/>
-        </w:rPr>
-        <w:t>1st Meeting of the Industrial Advisory Panel (IAP)</w:t>
-      </w:r>
-    </w:p>
-    <w:p>
-      <w:pPr>
-        <w:spacing w:after="160" w:before="80"/>
+        <w:spacing w:after="120" w:before="0"/>
         <w:jc w:val="center"/>
       </w:pPr>
       <w:r>
@@ -127,82 +97,12 @@
           <w:sz w:val="26"/>
           <w:u w:val="single"/>
         </w:rPr>
-        <w:t>Meeting Minutes</w:t>
+        <w:t>Proceedings of the 1st Meeting with the Industrial Advisory Panel</w:t>
       </w:r>
     </w:p>
     <w:p>
       <w:pPr>
-        <w:tabs>
-          <w:tab w:pos="1984" w:val="left"/>
-        </w:tabs>
-        <w:spacing w:after="0" w:before="0"/>
-      </w:pPr>
-      <w:r>
-        <w:t>Venue</w:t>
-        <w:tab/>
-        <w:t>: Conference Room, Department of ICE</w:t>
-      </w:r>
-    </w:p>
-    <w:p>
-      <w:pPr>
-        <w:tabs>
-          <w:tab w:pos="1984" w:val="left"/>
-        </w:tabs>
-        <w:spacing w:after="0" w:before="0"/>
-      </w:pPr>
-      <w:r>
-        <w:t>Date</w:t>
-        <w:tab/>
-        <w:t>: 18th March, 2023</w:t>
-      </w:r>
-    </w:p>
-    <w:p>
-      <w:pPr>
-        <w:tabs>
-          <w:tab w:pos="1984" w:val="left"/>
-        </w:tabs>
-        <w:spacing w:after="0" w:before="0"/>
-      </w:pPr>
-      <w:r>
-        <w:t>Day</w:t>
-        <w:tab/>
-        <w:t>: Saturday</w:t>
-      </w:r>
-    </w:p>
-    <w:p>
-      <w:pPr>
-        <w:tabs>
-          <w:tab w:pos="1984" w:val="left"/>
-        </w:tabs>
-        <w:spacing w:after="0" w:before="0"/>
-      </w:pPr>
-      <w:r>
-        <w:t>Starting Time</w:t>
-        <w:tab/>
-        <w:t>: 11:00 AM</w:t>
-      </w:r>
-    </w:p>
-    <w:p>
-      <w:pPr>
-        <w:tabs>
-          <w:tab w:pos="1984" w:val="left"/>
-        </w:tabs>
-        <w:spacing w:after="0" w:before="0"/>
-      </w:pPr>
-      <w:r>
-        <w:t>Ending Time</w:t>
-        <w:tab/>
-        <w:t>: ____________</w:t>
-      </w:r>
-    </w:p>
-    <w:p>
-      <w:pPr>
-        <w:spacing w:after="120" w:before="0"/>
-      </w:pPr>
-    </w:p>
-    <w:p>
-      <w:pPr>
-        <w:spacing w:after="160" w:before="0"/>
+        <w:spacing w:after="80" w:before="0"/>
         <w:jc w:val="both"/>
       </w:pPr>
       <w:r>
@@ -212,40 +112,69 @@
           <w:sz w:val="24"/>
           <w:u w:val="none"/>
         </w:rPr>
-        <w:t>The 1st meeting of the Industrial Advisory Panel (IAP) of the Department of Information and Communication Engineering (ICE) was held on 18th March, 2023 at the Conference Room, Department of ICE. The meeting was presided over by Md. Taslim Arefin, Associate Professor and Head, Department of ICE.</w:t>
+        <w:t>A meeting of the Department of Information and Communication Engineering with the members of the Industrial Advisory Panel was held as per the following schedule:</w:t>
       </w:r>
     </w:p>
     <w:p>
       <w:pPr>
-        <w:spacing w:after="40" w:before="0"/>
+        <w:spacing w:after="0" w:before="0"/>
       </w:pPr>
       <w:r>
         <w:rPr>
           <w:b/>
-          <w:i w:val="0"/>
-          <w:sz w:val="24"/>
-          <w:u w:val="none"/>
         </w:rPr>
-        <w:t>Members of the Industrial Advisory Panel present:</w:t>
+        <w:t xml:space="preserve">Date: </w:t>
+      </w:r>
+      <w:r>
+        <w:t>18th March, 2023 (Saturday)</w:t>
       </w:r>
     </w:p>
     <w:p>
       <w:pPr>
-        <w:spacing w:after="40" w:before="0"/>
+        <w:spacing w:after="0" w:before="0"/>
       </w:pPr>
       <w:r>
         <w:rPr>
-          <w:b w:val="0"/>
-          <w:i/>
-          <w:sz w:val="20"/>
-          <w:u w:val="none"/>
+          <w:b/>
         </w:rPr>
-        <w:t>(as per the signed attendance sheet)</w:t>
+        <w:t xml:space="preserve">Time: </w:t>
+      </w:r>
+      <w:r>
+        <w:t>11.00 am</w:t>
       </w:r>
     </w:p>
     <w:p>
       <w:pPr>
-        <w:spacing w:after="40" w:before="0"/>
+        <w:spacing w:after="0" w:before="0"/>
+      </w:pPr>
+      <w:r>
+        <w:rPr>
+          <w:b/>
+        </w:rPr>
+        <w:t xml:space="preserve">Venue: </w:t>
+      </w:r>
+      <w:r>
+        <w:t>Conference Room, Department of ICE</w:t>
+      </w:r>
+    </w:p>
+    <w:p>
+      <w:pPr>
+        <w:spacing w:after="0" w:before="0"/>
+      </w:pPr>
+      <w:r>
+        <w:rPr>
+          <w:b/>
+        </w:rPr>
+        <w:t xml:space="preserve">Chair: </w:t>
+      </w:r>
+      <w:r>
+        <w:t>Head, Department of ICE</w:t>
+      </w:r>
+    </w:p>
+    <w:p>
+      <w:pPr>
+        <w:spacing w:after="80" w:before="80"/>
+        <w:jc w:val="both"/>
       </w:pPr>
       <w:r>
         <w:rPr>
@@ -254,147 +183,7 @@
           <w:sz w:val="24"/>
           <w:u w:val="none"/>
         </w:rPr>
-        <w:t>1.  ____________________________________________________________</w:t>
-      </w:r>
-    </w:p>
-    <w:p>
-      <w:pPr>
-        <w:spacing w:after="40" w:before="0"/>
-      </w:pPr>
-      <w:r>
-        <w:rPr>
-          <w:b w:val="0"/>
-          <w:i w:val="0"/>
-          <w:sz w:val="24"/>
-          <w:u w:val="none"/>
-        </w:rPr>
-        <w:t>2.  ____________________________________________________________</w:t>
-      </w:r>
-    </w:p>
-    <w:p>
-      <w:pPr>
-        <w:spacing w:after="40" w:before="0"/>
-      </w:pPr>
-      <w:r>
-        <w:rPr>
-          <w:b w:val="0"/>
-          <w:i w:val="0"/>
-          <w:sz w:val="24"/>
-          <w:u w:val="none"/>
-        </w:rPr>
-        <w:t>3.  ____________________________________________________________</w:t>
-      </w:r>
-    </w:p>
-    <w:p>
-      <w:pPr>
-        <w:spacing w:after="40" w:before="0"/>
-      </w:pPr>
-      <w:r>
-        <w:rPr>
-          <w:b w:val="0"/>
-          <w:i w:val="0"/>
-          <w:sz w:val="24"/>
-          <w:u w:val="none"/>
-        </w:rPr>
-        <w:t>4.  ____________________________________________________________</w:t>
-      </w:r>
-    </w:p>
-    <w:p>
-      <w:pPr>
-        <w:spacing w:after="40" w:before="120"/>
-      </w:pPr>
-      <w:r>
-        <w:rPr>
-          <w:b/>
-          <w:i w:val="0"/>
-          <w:sz w:val="24"/>
-          <w:u w:val="none"/>
-        </w:rPr>
-        <w:t>Faculty members of the Department of ICE present:</w:t>
-      </w:r>
-    </w:p>
-    <w:p>
-      <w:pPr>
-        <w:spacing w:after="40" w:before="0"/>
-      </w:pPr>
-      <w:r>
-        <w:rPr>
-          <w:b w:val="0"/>
-          <w:i/>
-          <w:sz w:val="20"/>
-          <w:u w:val="none"/>
-        </w:rPr>
-        <w:t>(as per the signed attendance sheet)</w:t>
-      </w:r>
-    </w:p>
-    <w:p>
-      <w:pPr>
-        <w:spacing w:after="40" w:before="0"/>
-      </w:pPr>
-      <w:r>
-        <w:rPr>
-          <w:b w:val="0"/>
-          <w:i w:val="0"/>
-          <w:sz w:val="24"/>
-          <w:u w:val="none"/>
-        </w:rPr>
-        <w:t>1.  ____________________________________________________________</w:t>
-      </w:r>
-    </w:p>
-    <w:p>
-      <w:pPr>
-        <w:spacing w:after="40" w:before="0"/>
-      </w:pPr>
-      <w:r>
-        <w:rPr>
-          <w:b w:val="0"/>
-          <w:i w:val="0"/>
-          <w:sz w:val="24"/>
-          <w:u w:val="none"/>
-        </w:rPr>
-        <w:t>2.  ____________________________________________________________</w:t>
-      </w:r>
-    </w:p>
-    <w:p>
-      <w:pPr>
-        <w:spacing w:after="40" w:before="0"/>
-      </w:pPr>
-      <w:r>
-        <w:rPr>
-          <w:b w:val="0"/>
-          <w:i w:val="0"/>
-          <w:sz w:val="24"/>
-          <w:u w:val="none"/>
-        </w:rPr>
-        <w:t>3.  ____________________________________________________________</w:t>
-      </w:r>
-    </w:p>
-    <w:p>
-      <w:pPr>
-        <w:spacing w:after="40" w:before="0"/>
-      </w:pPr>
-      <w:r>
-        <w:rPr>
-          <w:b w:val="0"/>
-          <w:i w:val="0"/>
-          <w:sz w:val="24"/>
-          <w:u w:val="none"/>
-        </w:rPr>
-        <w:t>4.  ____________________________________________________________</w:t>
-      </w:r>
-    </w:p>
-    <w:p>
-      <w:pPr>
-        <w:spacing w:after="80" w:before="200"/>
-      </w:pPr>
-      <w:r>
-        <w:rPr>
-          <w:b/>
-          <w:i w:val="0"/>
-          <w:sz w:val="24"/>
-          <w:u w:val="none"/>
-        </w:rPr>
-        <w:t>Agenda, Discussion and Decisions</w:t>
+        <w:t>The meeting commenced with a warm welcome from the Head of the Department, who thanked all industry experts for their valuable time and continuous support in strengthening academia-industry collaboration. The following agenda items were discussed in detail, and the corresponding decisions and responsibilities were recorded as follows:</w:t>
       </w:r>
     </w:p>
     <w:tbl>
@@ -406,16 +195,15 @@
         <w:tblLook w:firstColumn="1" w:firstRow="1" w:lastColumn="0" w:lastRow="0" w:noHBand="0" w:noVBand="1" w:val="04A0"/>
       </w:tblPr>
       <w:tblGrid>
-        <w:gridCol w:w="510"/>
-        <w:gridCol w:w="2381"/>
-        <w:gridCol w:w="3175"/>
+        <w:gridCol w:w="850"/>
         <w:gridCol w:w="2154"/>
-        <w:gridCol w:w="1701"/>
+        <w:gridCol w:w="5216"/>
+        <w:gridCol w:w="1928"/>
       </w:tblGrid>
       <w:tr>
         <w:tc>
           <w:tcPr>
-            <w:tcW w:type="dxa" w:w="510"/>
+            <w:tcW w:type="dxa" w:w="850"/>
             <w:shd w:val="clear" w:color="auto" w:fill="D9D9D9"/>
           </w:tcPr>
           <w:p>
@@ -428,13 +216,13 @@
                 <w:b/>
                 <w:sz w:val="20"/>
               </w:rPr>
-              <w:t>SL</w:t>
+              <w:t>Serial No.</w:t>
             </w:r>
           </w:p>
         </w:tc>
         <w:tc>
           <w:tcPr>
-            <w:tcW w:type="dxa" w:w="2381"/>
+            <w:tcW w:type="dxa" w:w="2154"/>
             <w:shd w:val="clear" w:color="auto" w:fill="D9D9D9"/>
           </w:tcPr>
           <w:p>
@@ -453,26 +241,7 @@
         </w:tc>
         <w:tc>
           <w:tcPr>
-            <w:tcW w:type="dxa" w:w="3175"/>
-            <w:shd w:val="clear" w:color="auto" w:fill="D9D9D9"/>
-          </w:tcPr>
-          <w:p>
-            <w:pPr>
-              <w:jc w:val="center"/>
-            </w:pPr>
-            <w:r/>
-            <w:r>
-              <w:rPr>
-                <w:b/>
-                <w:sz w:val="20"/>
-              </w:rPr>
-              <w:t>Discussion / Suggestions of IAP</w:t>
-            </w:r>
-          </w:p>
-        </w:tc>
-        <w:tc>
-          <w:tcPr>
-            <w:tcW w:type="dxa" w:w="2154"/>
+            <w:tcW w:type="dxa" w:w="5216"/>
             <w:shd w:val="clear" w:color="auto" w:fill="D9D9D9"/>
           </w:tcPr>
           <w:p>
@@ -491,7 +260,7 @@
         </w:tc>
         <w:tc>
           <w:tcPr>
-            <w:tcW w:type="dxa" w:w="1701"/>
+            <w:tcW w:type="dxa" w:w="1928"/>
             <w:shd w:val="clear" w:color="auto" w:fill="D9D9D9"/>
           </w:tcPr>
           <w:p>
@@ -504,18 +273,15 @@
                 <w:b/>
                 <w:sz w:val="20"/>
               </w:rPr>
-              <w:t>Responsibility</w:t>
+              <w:t>Responsible</w:t>
             </w:r>
           </w:p>
         </w:tc>
       </w:tr>
       <w:tr>
-        <w:trPr>
-          <w:trHeight w:val="1020" w:hRule="atLeast"/>
-        </w:trPr>
         <w:tc>
           <w:tcPr>
-            <w:tcW w:type="dxa" w:w="510"/>
+            <w:tcW w:type="dxa" w:w="850"/>
           </w:tcPr>
           <w:p>
             <w:r/>
@@ -523,34 +289,7 @@
               <w:rPr>
                 <w:sz w:val="20"/>
               </w:rPr>
-              <w:t>1</w:t>
-            </w:r>
-          </w:p>
-        </w:tc>
-        <w:tc>
-          <w:tcPr>
-            <w:tcW w:type="dxa" w:w="2381"/>
-          </w:tcPr>
-          <w:p>
-            <w:r/>
-            <w:r>
-              <w:rPr>
-                <w:sz w:val="20"/>
-              </w:rPr>
-              <w:t>Introduction of the Industrial Advisory Panel members and Terms of Reference</w:t>
-            </w:r>
-          </w:p>
-        </w:tc>
-        <w:tc>
-          <w:tcPr>
-            <w:tcW w:type="dxa" w:w="3175"/>
-          </w:tcPr>
-          <w:p>
-            <w:r/>
-            <w:r>
-              <w:rPr>
-                <w:sz w:val="20"/>
-              </w:rPr>
+              <w:t>01</w:t>
             </w:r>
           </w:p>
         </w:tc>
@@ -564,12 +303,13 @@
               <w:rPr>
                 <w:sz w:val="20"/>
               </w:rPr>
+              <w:t>Introduction of IAP Members and Terms of Reference</w:t>
             </w:r>
           </w:p>
         </w:tc>
         <w:tc>
           <w:tcPr>
-            <w:tcW w:type="dxa" w:w="1701"/>
+            <w:tcW w:type="dxa" w:w="5216"/>
           </w:tcPr>
           <w:p>
             <w:r/>
@@ -577,17 +317,13 @@
               <w:rPr>
                 <w:sz w:val="20"/>
               </w:rPr>
+              <w:t>The Head welcomed the members and introduced the newly formed Industrial Advisory Panel. The Terms of Reference were presented: the panel will meet at least twice a year and advise the department on curriculum, industrial attachment, industrial visits and capstone projects.</w:t>
             </w:r>
           </w:p>
         </w:tc>
-      </w:tr>
-      <w:tr>
-        <w:trPr>
-          <w:trHeight w:val="1020" w:hRule="atLeast"/>
-        </w:trPr>
         <w:tc>
           <w:tcPr>
-            <w:tcW w:type="dxa" w:w="510"/>
+            <w:tcW w:type="dxa" w:w="1928"/>
           </w:tcPr>
           <w:p>
             <w:r/>
@@ -595,13 +331,15 @@
               <w:rPr>
                 <w:sz w:val="20"/>
               </w:rPr>
-              <w:t>2</w:t>
+              <w:t>Head, Department of ICE</w:t>
             </w:r>
           </w:p>
         </w:tc>
+      </w:tr>
+      <w:tr>
         <w:tc>
           <w:tcPr>
-            <w:tcW w:type="dxa" w:w="2381"/>
+            <w:tcW w:type="dxa" w:w="850"/>
           </w:tcPr>
           <w:p>
             <w:r/>
@@ -609,20 +347,7 @@
               <w:rPr>
                 <w:sz w:val="20"/>
               </w:rPr>
-              <w:t>Review of the existing curriculum of B.Sc. in ICE</w:t>
-            </w:r>
-          </w:p>
-        </w:tc>
-        <w:tc>
-          <w:tcPr>
-            <w:tcW w:type="dxa" w:w="3175"/>
-          </w:tcPr>
-          <w:p>
-            <w:r/>
-            <w:r>
-              <w:rPr>
-                <w:sz w:val="20"/>
-              </w:rPr>
+              <w:t>02</w:t>
             </w:r>
           </w:p>
         </w:tc>
@@ -636,12 +361,13 @@
               <w:rPr>
                 <w:sz w:val="20"/>
               </w:rPr>
+              <w:t>Review of the Existing Curriculum</w:t>
             </w:r>
           </w:p>
         </w:tc>
         <w:tc>
           <w:tcPr>
-            <w:tcW w:type="dxa" w:w="1701"/>
+            <w:tcW w:type="dxa" w:w="5216"/>
           </w:tcPr>
           <w:p>
             <w:r/>
@@ -649,17 +375,13 @@
               <w:rPr>
                 <w:sz w:val="20"/>
               </w:rPr>
+              <w:t>The panel suggested that the practical content of networking, telecommunication and embedded systems courses should be strengthened. The department will collect course-wise suggestions from the members for the next curriculum review.</w:t>
             </w:r>
           </w:p>
         </w:tc>
-      </w:tr>
-      <w:tr>
-        <w:trPr>
-          <w:trHeight w:val="1020" w:hRule="atLeast"/>
-        </w:trPr>
         <w:tc>
           <w:tcPr>
-            <w:tcW w:type="dxa" w:w="510"/>
+            <w:tcW w:type="dxa" w:w="1928"/>
           </w:tcPr>
           <w:p>
             <w:r/>
@@ -667,13 +389,15 @@
               <w:rPr>
                 <w:sz w:val="20"/>
               </w:rPr>
-              <w:t>3</w:t>
+              <w:t>Head / Course Teachers</w:t>
             </w:r>
           </w:p>
         </w:tc>
+      </w:tr>
+      <w:tr>
         <w:tc>
           <w:tcPr>
-            <w:tcW w:type="dxa" w:w="2381"/>
+            <w:tcW w:type="dxa" w:w="850"/>
           </w:tcPr>
           <w:p>
             <w:r/>
@@ -681,20 +405,7 @@
               <w:rPr>
                 <w:sz w:val="20"/>
               </w:rPr>
-              <w:t>Industry expectations and skill gaps of ICE graduates</w:t>
-            </w:r>
-          </w:p>
-        </w:tc>
-        <w:tc>
-          <w:tcPr>
-            <w:tcW w:type="dxa" w:w="3175"/>
-          </w:tcPr>
-          <w:p>
-            <w:r/>
-            <w:r>
-              <w:rPr>
-                <w:sz w:val="20"/>
-              </w:rPr>
+              <w:t>03</w:t>
             </w:r>
           </w:p>
         </w:tc>
@@ -708,12 +419,13 @@
               <w:rPr>
                 <w:sz w:val="20"/>
               </w:rPr>
+              <w:t>Industry Expectations and Skill Gaps</w:t>
             </w:r>
           </w:p>
         </w:tc>
         <w:tc>
           <w:tcPr>
-            <w:tcW w:type="dxa" w:w="1701"/>
+            <w:tcW w:type="dxa" w:w="5216"/>
           </w:tcPr>
           <w:p>
             <w:r/>
@@ -721,17 +433,13 @@
               <w:rPr>
                 <w:sz w:val="20"/>
               </w:rPr>
+              <w:t>The panel observed gaps in hands-on network configuration, Linux administration and communication skills of graduates. The department will arrange workshops and training sessions with industry experts.</w:t>
             </w:r>
           </w:p>
         </w:tc>
-      </w:tr>
-      <w:tr>
-        <w:trPr>
-          <w:trHeight w:val="1020" w:hRule="atLeast"/>
-        </w:trPr>
         <w:tc>
           <w:tcPr>
-            <w:tcW w:type="dxa" w:w="510"/>
+            <w:tcW w:type="dxa" w:w="1928"/>
           </w:tcPr>
           <w:p>
             <w:r/>
@@ -739,13 +447,15 @@
               <w:rPr>
                 <w:sz w:val="20"/>
               </w:rPr>
-              <w:t>4</w:t>
+              <w:t>Faculty Members / IAP Members</w:t>
             </w:r>
           </w:p>
         </w:tc>
+      </w:tr>
+      <w:tr>
         <w:tc>
           <w:tcPr>
-            <w:tcW w:type="dxa" w:w="2381"/>
+            <w:tcW w:type="dxa" w:w="850"/>
           </w:tcPr>
           <w:p>
             <w:r/>
@@ -753,20 +463,7 @@
               <w:rPr>
                 <w:sz w:val="20"/>
               </w:rPr>
-              <w:t>Industrial attachment / internship opportunities</w:t>
-            </w:r>
-          </w:p>
-        </w:tc>
-        <w:tc>
-          <w:tcPr>
-            <w:tcW w:type="dxa" w:w="3175"/>
-          </w:tcPr>
-          <w:p>
-            <w:r/>
-            <w:r>
-              <w:rPr>
-                <w:sz w:val="20"/>
-              </w:rPr>
+              <w:t>04</w:t>
             </w:r>
           </w:p>
         </w:tc>
@@ -780,12 +477,13 @@
               <w:rPr>
                 <w:sz w:val="20"/>
               </w:rPr>
+              <w:t>Industrial Attachment / Internship</w:t>
             </w:r>
           </w:p>
         </w:tc>
         <w:tc>
           <w:tcPr>
-            <w:tcW w:type="dxa" w:w="1701"/>
+            <w:tcW w:type="dxa" w:w="5216"/>
           </w:tcPr>
           <w:p>
             <w:r/>
@@ -793,17 +491,13 @@
               <w:rPr>
                 <w:sz w:val="20"/>
               </w:rPr>
+              <w:t>Members agreed to explore internship opportunities for ICE students in their organizations. The department will send formal placement request letters to industry partners.</w:t>
             </w:r>
           </w:p>
         </w:tc>
-      </w:tr>
-      <w:tr>
-        <w:trPr>
-          <w:trHeight w:val="1020" w:hRule="atLeast"/>
-        </w:trPr>
         <w:tc>
           <w:tcPr>
-            <w:tcW w:type="dxa" w:w="510"/>
+            <w:tcW w:type="dxa" w:w="1928"/>
           </w:tcPr>
           <w:p>
             <w:r/>
@@ -811,13 +505,15 @@
               <w:rPr>
                 <w:sz w:val="20"/>
               </w:rPr>
-              <w:t>5</w:t>
+              <w:t>ICE Office / IAP Members</w:t>
             </w:r>
           </w:p>
         </w:tc>
+      </w:tr>
+      <w:tr>
         <w:tc>
           <w:tcPr>
-            <w:tcW w:type="dxa" w:w="2381"/>
+            <w:tcW w:type="dxa" w:w="850"/>
           </w:tcPr>
           <w:p>
             <w:r/>
@@ -825,20 +521,7 @@
               <w:rPr>
                 <w:sz w:val="20"/>
               </w:rPr>
-              <w:t>Industrial visit plan for students</w:t>
-            </w:r>
-          </w:p>
-        </w:tc>
-        <w:tc>
-          <w:tcPr>
-            <w:tcW w:type="dxa" w:w="3175"/>
-          </w:tcPr>
-          <w:p>
-            <w:r/>
-            <w:r>
-              <w:rPr>
-                <w:sz w:val="20"/>
-              </w:rPr>
+              <w:t>05</w:t>
             </w:r>
           </w:p>
         </w:tc>
@@ -852,12 +535,13 @@
               <w:rPr>
                 <w:sz w:val="20"/>
               </w:rPr>
+              <w:t>Industrial Visit</w:t>
             </w:r>
           </w:p>
         </w:tc>
         <w:tc>
           <w:tcPr>
-            <w:tcW w:type="dxa" w:w="1701"/>
+            <w:tcW w:type="dxa" w:w="5216"/>
           </w:tcPr>
           <w:p>
             <w:r/>
@@ -865,17 +549,13 @@
               <w:rPr>
                 <w:sz w:val="20"/>
               </w:rPr>
+              <w:t>It was agreed that at least one industrial visit will be arranged each semester to ISP, telecom and technology companies. The department will send visit permission letters in advance.</w:t>
             </w:r>
           </w:p>
         </w:tc>
-      </w:tr>
-      <w:tr>
-        <w:trPr>
-          <w:trHeight w:val="1020" w:hRule="atLeast"/>
-        </w:trPr>
         <w:tc>
           <w:tcPr>
-            <w:tcW w:type="dxa" w:w="510"/>
+            <w:tcW w:type="dxa" w:w="1928"/>
           </w:tcPr>
           <w:p>
             <w:r/>
@@ -883,13 +563,29 @@
               <w:rPr>
                 <w:sz w:val="20"/>
               </w:rPr>
-              <w:t>6</w:t>
+              <w:t>ICE Office / Course Teachers</w:t>
+            </w:r>
+          </w:p>
+        </w:tc>
+      </w:tr>
+      <w:tr>
+        <w:tc>
+          <w:tcPr>
+            <w:tcW w:type="dxa" w:w="850"/>
+          </w:tcPr>
+          <w:p>
+            <w:r/>
+            <w:r>
+              <w:rPr>
+                <w:sz w:val="20"/>
+              </w:rPr>
+              <w:t>06</w:t>
             </w:r>
           </w:p>
         </w:tc>
         <w:tc>
           <w:tcPr>
-            <w:tcW w:type="dxa" w:w="2381"/>
+            <w:tcW w:type="dxa" w:w="2154"/>
           </w:tcPr>
           <w:p>
             <w:r/>
@@ -903,7 +599,7 @@
         </w:tc>
         <w:tc>
           <w:tcPr>
-            <w:tcW w:type="dxa" w:w="3175"/>
+            <w:tcW w:type="dxa" w:w="5216"/>
           </w:tcPr>
           <w:p>
             <w:r/>
@@ -911,12 +607,13 @@
               <w:rPr>
                 <w:sz w:val="20"/>
               </w:rPr>
+              <w:t>The next meeting of the panel will be held in the Fall 2023 semester.</w:t>
             </w:r>
           </w:p>
         </w:tc>
         <w:tc>
           <w:tcPr>
-            <w:tcW w:type="dxa" w:w="2154"/>
+            <w:tcW w:type="dxa" w:w="1928"/>
           </w:tcPr>
           <w:p>
             <w:r/>
@@ -924,19 +621,7 @@
               <w:rPr>
                 <w:sz w:val="20"/>
               </w:rPr>
-            </w:r>
-          </w:p>
-        </w:tc>
-        <w:tc>
-          <w:tcPr>
-            <w:tcW w:type="dxa" w:w="1701"/>
-          </w:tcPr>
-          <w:p>
-            <w:r/>
-            <w:r>
-              <w:rPr>
-                <w:sz w:val="20"/>
-              </w:rPr>
+              <w:t>Head, Department of ICE</w:t>
             </w:r>
           </w:p>
         </w:tc>
@@ -944,7 +629,7 @@
     </w:tbl>
     <w:p>
       <w:pPr>
-        <w:spacing w:after="480" w:before="200"/>
+        <w:spacing w:after="320" w:before="160"/>
         <w:jc w:val="both"/>
       </w:pPr>
       <w:r>
@@ -954,186 +639,84 @@
           <w:sz w:val="24"/>
           <w:u w:val="none"/>
         </w:rPr>
-        <w:t>As there was no other issue to discuss, the meeting ended with a vote of thanks to all the members present.</w:t>
+        <w:t>As there were no other issues to discuss, the Head declared the meeting closed with a vote of thanks to all members present.</w:t>
       </w:r>
     </w:p>
-    <w:tbl>
-      <w:tblPr>
-        <w:tblW w:type="auto" w:w="0"/>
-        <w:jc w:val="center"/>
-        <w:tblLook w:firstColumn="1" w:firstRow="1" w:lastColumn="0" w:lastRow="0" w:noHBand="0" w:noVBand="1" w:val="04A0"/>
-      </w:tblPr>
-      <w:tblGrid>
-        <w:gridCol w:w="4968"/>
-        <w:gridCol w:w="4968"/>
-      </w:tblGrid>
-      <w:tr>
-        <w:tc>
-          <w:tcPr>
-            <w:tcW w:type="dxa" w:w="4968"/>
-          </w:tcPr>
-          <w:p>
-            <w:pPr>
-              <w:jc w:val="center"/>
-            </w:pPr>
-            <w:r/>
-            <w:r>
-              <w:rPr>
-                <w:b/>
-              </w:rPr>
-              <w:t>Prepared By</w:t>
-            </w:r>
-          </w:p>
-          <w:p>
-            <w:pPr>
-              <w:jc w:val="center"/>
-            </w:pPr>
-          </w:p>
-          <w:p>
-            <w:pPr>
-              <w:jc w:val="center"/>
-            </w:pPr>
-          </w:p>
-          <w:p>
-            <w:pPr>
-              <w:jc w:val="center"/>
-            </w:pPr>
-            <w:r>
-              <w:rPr>
-                <w:b w:val="0"/>
-              </w:rPr>
-              <w:t>_______________________</w:t>
-            </w:r>
-          </w:p>
-          <w:p>
-            <w:pPr>
-              <w:jc w:val="center"/>
-            </w:pPr>
-            <w:r>
-              <w:rPr>
-                <w:b/>
-              </w:rPr>
-              <w:t>Murad Rahman Saud</w:t>
-            </w:r>
-          </w:p>
-          <w:p>
-            <w:pPr>
-              <w:jc w:val="center"/>
-            </w:pPr>
-            <w:r>
-              <w:rPr>
-                <w:b w:val="0"/>
-              </w:rPr>
-              <w:t>Coordination Officer</w:t>
-            </w:r>
-          </w:p>
-          <w:p>
-            <w:pPr>
-              <w:jc w:val="center"/>
-            </w:pPr>
-            <w:r>
-              <w:rPr>
-                <w:b w:val="0"/>
-              </w:rPr>
-              <w:t>Department of ICE</w:t>
-            </w:r>
-          </w:p>
-          <w:p>
-            <w:pPr>
-              <w:jc w:val="center"/>
-            </w:pPr>
-            <w:r>
-              <w:rPr>
-                <w:b w:val="0"/>
-              </w:rPr>
-              <w:t>Daffodil International University</w:t>
-            </w:r>
-          </w:p>
-        </w:tc>
-        <w:tc>
-          <w:tcPr>
-            <w:tcW w:type="dxa" w:w="4968"/>
-          </w:tcPr>
-          <w:p>
-            <w:pPr>
-              <w:jc w:val="center"/>
-            </w:pPr>
-            <w:r/>
-            <w:r>
-              <w:rPr>
-                <w:b/>
-              </w:rPr>
-              <w:t>Approved By</w:t>
-            </w:r>
-          </w:p>
-          <w:p>
-            <w:pPr>
-              <w:jc w:val="center"/>
-            </w:pPr>
-          </w:p>
-          <w:p>
-            <w:pPr>
-              <w:jc w:val="center"/>
-            </w:pPr>
-          </w:p>
-          <w:p>
-            <w:pPr>
-              <w:jc w:val="center"/>
-            </w:pPr>
-            <w:r>
-              <w:rPr>
-                <w:b w:val="0"/>
-              </w:rPr>
-              <w:t>_______________________</w:t>
-            </w:r>
-          </w:p>
-          <w:p>
-            <w:pPr>
-              <w:jc w:val="center"/>
-            </w:pPr>
-            <w:r>
-              <w:rPr>
-                <w:b/>
-              </w:rPr>
-              <w:t>Md. Taslim Arefin</w:t>
-            </w:r>
-          </w:p>
-          <w:p>
-            <w:pPr>
-              <w:jc w:val="center"/>
-            </w:pPr>
-            <w:r>
-              <w:rPr>
-                <w:b w:val="0"/>
-              </w:rPr>
-              <w:t>Associate Professor &amp; Head</w:t>
-            </w:r>
-          </w:p>
-          <w:p>
-            <w:pPr>
-              <w:jc w:val="center"/>
-            </w:pPr>
-            <w:r>
-              <w:rPr>
-                <w:b w:val="0"/>
-              </w:rPr>
-              <w:t>Department of ICE</w:t>
-            </w:r>
-          </w:p>
-          <w:p>
-            <w:pPr>
-              <w:jc w:val="center"/>
-            </w:pPr>
-            <w:r>
-              <w:rPr>
-                <w:b w:val="0"/>
-              </w:rPr>
-              <w:t>Daffodil International University</w:t>
-            </w:r>
-          </w:p>
-        </w:tc>
-      </w:tr>
-    </w:tbl>
+    <w:p>
+      <w:pPr>
+        <w:spacing w:after="0" w:before="0"/>
+        <w:ind w:left="6048"/>
+      </w:pPr>
+      <w:r>
+        <w:rPr>
+          <w:b w:val="0"/>
+          <w:i w:val="0"/>
+          <w:sz w:val="24"/>
+          <w:u w:val="none"/>
+        </w:rPr>
+        <w:t>_______________________</w:t>
+      </w:r>
+    </w:p>
+    <w:p>
+      <w:pPr>
+        <w:spacing w:after="0" w:before="0"/>
+        <w:ind w:left="6048"/>
+      </w:pPr>
+      <w:r>
+        <w:rPr>
+          <w:b/>
+          <w:i w:val="0"/>
+          <w:sz w:val="24"/>
+          <w:u w:val="none"/>
+        </w:rPr>
+        <w:t>Md. Taslim Arefin</w:t>
+      </w:r>
+    </w:p>
+    <w:p>
+      <w:pPr>
+        <w:spacing w:after="0" w:before="0"/>
+        <w:ind w:left="6048"/>
+      </w:pPr>
+      <w:r>
+        <w:rPr>
+          <w:b w:val="0"/>
+          <w:i w:val="0"/>
+          <w:sz w:val="24"/>
+          <w:u w:val="none"/>
+        </w:rPr>
+        <w:t>Associate Professor &amp; Head</w:t>
+      </w:r>
+    </w:p>
+    <w:p>
+      <w:pPr>
+        <w:spacing w:after="0" w:before="0"/>
+        <w:ind w:left="6048"/>
+      </w:pPr>
+      <w:r>
+        <w:rPr>
+          <w:b w:val="0"/>
+          <w:i w:val="0"/>
+          <w:sz w:val="24"/>
+          <w:u w:val="none"/>
+        </w:rPr>
+        <w:t>Department of ICE</w:t>
+      </w:r>
+    </w:p>
+    <w:p>
+      <w:pPr>
+        <w:spacing w:after="0" w:before="0"/>
+        <w:ind w:left="6048"/>
+      </w:pPr>
+      <w:r>
+        <w:rPr>
+          <w:b w:val="0"/>
+          <w:i w:val="0"/>
+          <w:sz w:val="24"/>
+          <w:u w:val="none"/>
+        </w:rPr>
+        <w:t>Daffodil International University</w:t>
+      </w:r>
+    </w:p>
     <w:sectPr>
       <w:pgSz w:w="12240" w:h="15840"/>
       <w:pgMar w:top="720" w:right="1152" w:bottom="720" w:left="1152" w:header="720" w:footer="720" w:gutter="0"/>

</xml_diff>